<commit_message>
Add Saylor certificate to resume downloads
</commit_message>
<xml_diff>
--- a/Felix-Adriel-Hate-Resume.docx
+++ b/Felix-Adriel-Hate-Resume.docx
@@ -156,7 +156,7 @@
         </w:rPr>
         <w:t>Quezon City, Philippines | +63 965-382-2899 | felixadriel.hate@neu.edu.ph</w:t>
         <w:br/>
-        <w:t>linkedin.com/in/hate-felix-adriel-a-0369a3354</w:t>
+        <w:t>linkedin.com/in/hate-felix-adriel/</w:t>
         <w:br/>
         <w:t>felix-adriel-portfolio.vercel.app</w:t>
       </w:r>
@@ -443,6 +443,14 @@
       </w:pPr>
       <w:r>
         <w:t>SQL and Relational Databases 101 | Oracle | Issued Oct 2024; expires Oct 2027</w:t>
+      </w:r>
+    </w:p>
+    <w:p>
+      <w:pPr>
+        <w:widowControl/>
+      </w:pPr>
+      <w:r>
+        <w:t>CS205: Building with Artificial Intelligence | Saylor University | Issued Oct 7, 2026</w:t>
       </w:r>
     </w:p>
     <w:p>

</xml_diff>